<commit_message>
Prosedürler: 165 belgeye Ali Kaan Genç ve Fatih Salbars imzaları, imzalar ismin altındaki kutularda; BAYDOĞAN adı düzeltildi; sitede revizyon değişen belgelerin buluttaki dosyası yerinde yenilenir
Co-Authored-By: Claude Opus 5.5 <noreply@anthropic.com>
Claude-Session: https://claude.ai/code/session_01J6foNXTwf1dGzDjULYpfrk
</commit_message>
<xml_diff>
--- a/prosedurler/EMS.BG.POL.15.01. Information Security and Data Protection Policy.docx
+++ b/prosedurler/EMS.BG.POL.15.01. Information Security and Data Protection Policy.docx
@@ -1905,69 +1905,6 @@
                 <w:color w:val="000000"/>
                 <w:lang w:val="en-GB" w:eastAsia="en-GB"/>
               </w:rPr>
-              <w:drawing>
-                <wp:anchor distT="0" distB="0" distL="114300" distR="114300" simplePos="0" relativeHeight="251658240" behindDoc="0" locked="0" layoutInCell="1" allowOverlap="1" wp14:anchorId="168E1990" wp14:editId="230A926C">
-                  <wp:simplePos x="0" y="0"/>
-                  <wp:positionH relativeFrom="column">
-                    <wp:posOffset>-143510</wp:posOffset>
-                  </wp:positionH>
-                  <wp:positionV relativeFrom="paragraph">
-                    <wp:posOffset>153670</wp:posOffset>
-                  </wp:positionV>
-                  <wp:extent cx="1569720" cy="1046480"/>
-                  <wp:effectExtent l="0" t="0" r="0" b="0"/>
-                  <wp:wrapNone/>
-                  <wp:docPr id="1968470152" name="Resim 1"/>
-                  <wp:cNvGraphicFramePr>
-                    <a:graphicFrameLocks xmlns:a="http://schemas.openxmlformats.org/drawingml/2006/main" noChangeAspect="1"/>
-                  </wp:cNvGraphicFramePr>
-                  <a:graphic xmlns:a="http://schemas.openxmlformats.org/drawingml/2006/main">
-                    <a:graphicData uri="http://schemas.openxmlformats.org/drawingml/2006/picture">
-                      <pic:pic xmlns:pic="http://schemas.openxmlformats.org/drawingml/2006/picture">
-                        <pic:nvPicPr>
-                          <pic:cNvPr id="1968470152" name="Resim 1968470152"/>
-                          <pic:cNvPicPr/>
-                        </pic:nvPicPr>
-                        <pic:blipFill>
-                          <a:blip r:embed="rId9" cstate="print">
-                            <a:extLst>
-                              <a:ext uri="{28A0092B-C50C-407E-A947-70E740481C1C}">
-                                <a14:useLocalDpi xmlns:a14="http://schemas.microsoft.com/office/drawing/2010/main" val="0"/>
-                              </a:ext>
-                            </a:extLst>
-                          </a:blip>
-                          <a:stretch>
-                            <a:fillRect/>
-                          </a:stretch>
-                        </pic:blipFill>
-                        <pic:spPr>
-                          <a:xfrm>
-                            <a:off x="0" y="0"/>
-                            <a:ext cx="1569720" cy="1046480"/>
-                          </a:xfrm>
-                          <a:prstGeom prst="rect">
-                            <a:avLst/>
-                          </a:prstGeom>
-                        </pic:spPr>
-                      </pic:pic>
-                    </a:graphicData>
-                  </a:graphic>
-                  <wp14:sizeRelH relativeFrom="page">
-                    <wp14:pctWidth>0</wp14:pctWidth>
-                  </wp14:sizeRelH>
-                  <wp14:sizeRelV relativeFrom="page">
-                    <wp14:pctHeight>0</wp14:pctHeight>
-                  </wp14:sizeRelV>
-                </wp:anchor>
-              </w:drawing>
-            </w:r>
-            <w:r>
-              <w:rPr>
-                <w:rFonts w:ascii="Calibri" w:eastAsia="Times New Roman" w:hAnsi="Calibri" w:cs="Calibri"/>
-                <w:noProof/>
-                <w:color w:val="000000"/>
-                <w:lang w:val="en-GB" w:eastAsia="en-GB"/>
-              </w:rPr>
               <w:t>Kalite Güvence Müdürü</w:t>
             </w:r>
           </w:p>
@@ -2007,7 +1944,7 @@
                 <w:szCs w:val="18"/>
                 <w:lang w:val="en-GB" w:eastAsia="en-GB"/>
               </w:rPr>
-              <w:t>ABDULLAH BAYDOGAN</w:t>
+              <w:t>ABDULLAH BAYDOĞAN</w:t>
             </w:r>
           </w:p>
         </w:tc>
@@ -2173,7 +2110,7 @@
               <w:bottom w:val="single" w:sz="4" w:space="0" w:color="auto"/>
               <w:right w:val="single" w:sz="4" w:space="0" w:color="auto"/>
             </w:tcBorders>
-            <w:vAlign w:val="bottom"/>
+            <w:vAlign w:val="center"/>
           </w:tcPr>
           <w:p>
             <w:pPr>
@@ -2185,6 +2122,43 @@
                 <w:lang w:val="en-GB" w:eastAsia="en-GB"/>
               </w:rPr>
             </w:pPr>
+            <w:r>
+              <w:drawing>
+                <wp:inline distT="0" distB="0" distL="0" distR="0">
+                  <wp:extent cx="659218" cy="566928"/>
+                  <wp:effectExtent l="0" t="0" r="0" b="0"/>
+                  <wp:docPr id="900102" name="Imza Ali Kaan Genc"/>
+                  <wp:cNvGraphicFramePr>
+                    <a:graphicFrameLocks xmlns:a="http://schemas.openxmlformats.org/drawingml/2006/main" noChangeAspect="1"/>
+                  </wp:cNvGraphicFramePr>
+                  <a:graphic xmlns:a="http://schemas.openxmlformats.org/drawingml/2006/main">
+                    <a:graphicData uri="http://schemas.openxmlformats.org/drawingml/2006/picture">
+                      <pic:pic xmlns:pic="http://schemas.openxmlformats.org/drawingml/2006/picture">
+                        <pic:nvPicPr>
+                          <pic:cNvPr id="900102" name="Imza Ali Kaan Genc"/>
+                          <pic:cNvPicPr/>
+                        </pic:nvPicPr>
+                        <pic:blipFill>
+                          <a:blip r:embed="sigAliKaan"/>
+                          <a:stretch>
+                            <a:fillRect/>
+                          </a:stretch>
+                        </pic:blipFill>
+                        <pic:spPr>
+                          <a:xfrm>
+                            <a:off x="0" y="0"/>
+                            <a:ext cx="659218" cy="566928"/>
+                          </a:xfrm>
+                          <a:prstGeom prst="rect">
+                            <a:avLst/>
+                          </a:prstGeom>
+                        </pic:spPr>
+                      </pic:pic>
+                    </a:graphicData>
+                  </a:graphic>
+                </wp:inline>
+              </w:drawing>
+            </w:r>
           </w:p>
         </w:tc>
         <w:tc>
@@ -2221,7 +2195,7 @@
               <w:bottom w:val="single" w:sz="4" w:space="0" w:color="auto"/>
               <w:right w:val="single" w:sz="4" w:space="0" w:color="auto"/>
             </w:tcBorders>
-            <w:vAlign w:val="bottom"/>
+            <w:vAlign w:val="center"/>
           </w:tcPr>
           <w:p>
             <w:pPr>
@@ -2233,6 +2207,43 @@
                 <w:lang w:val="en-GB" w:eastAsia="en-GB"/>
               </w:rPr>
             </w:pPr>
+            <w:r>
+              <w:drawing>
+                <wp:inline distT="0" distB="0" distL="0" distR="0">
+                  <wp:extent cx="850392" cy="566928"/>
+                  <wp:effectExtent l="0" t="0" r="0" b="0"/>
+                  <wp:docPr id="900104" name="Imza Abdullah Baydogan"/>
+                  <wp:cNvGraphicFramePr>
+                    <a:graphicFrameLocks xmlns:a="http://schemas.openxmlformats.org/drawingml/2006/main" noChangeAspect="1"/>
+                  </wp:cNvGraphicFramePr>
+                  <a:graphic xmlns:a="http://schemas.openxmlformats.org/drawingml/2006/main">
+                    <a:graphicData uri="http://schemas.openxmlformats.org/drawingml/2006/picture">
+                      <pic:pic xmlns:pic="http://schemas.openxmlformats.org/drawingml/2006/picture">
+                        <pic:nvPicPr>
+                          <pic:cNvPr id="900104" name="Imza Abdullah Baydogan"/>
+                          <pic:cNvPicPr/>
+                        </pic:nvPicPr>
+                        <pic:blipFill>
+                          <a:blip r:embed="rId9"/>
+                          <a:stretch>
+                            <a:fillRect/>
+                          </a:stretch>
+                        </pic:blipFill>
+                        <pic:spPr>
+                          <a:xfrm>
+                            <a:off x="0" y="0"/>
+                            <a:ext cx="850392" cy="566928"/>
+                          </a:xfrm>
+                          <a:prstGeom prst="rect">
+                            <a:avLst/>
+                          </a:prstGeom>
+                        </pic:spPr>
+                      </pic:pic>
+                    </a:graphicData>
+                  </a:graphic>
+                </wp:inline>
+              </w:drawing>
+            </w:r>
           </w:p>
         </w:tc>
         <w:tc>
@@ -2269,7 +2280,7 @@
               <w:bottom w:val="single" w:sz="4" w:space="0" w:color="auto"/>
               <w:right w:val="single" w:sz="4" w:space="0" w:color="auto"/>
             </w:tcBorders>
-            <w:vAlign w:val="bottom"/>
+            <w:vAlign w:val="center"/>
           </w:tcPr>
           <w:p>
             <w:pPr>
@@ -2281,6 +2292,43 @@
                 <w:lang w:val="en-GB" w:eastAsia="en-GB"/>
               </w:rPr>
             </w:pPr>
+            <w:r>
+              <w:drawing>
+                <wp:inline distT="0" distB="0" distL="0" distR="0">
+                  <wp:extent cx="944879" cy="566928"/>
+                  <wp:effectExtent l="0" t="0" r="0" b="0"/>
+                  <wp:docPr id="900106" name="Imza Fatih Salbars"/>
+                  <wp:cNvGraphicFramePr>
+                    <a:graphicFrameLocks xmlns:a="http://schemas.openxmlformats.org/drawingml/2006/main" noChangeAspect="1"/>
+                  </wp:cNvGraphicFramePr>
+                  <a:graphic xmlns:a="http://schemas.openxmlformats.org/drawingml/2006/main">
+                    <a:graphicData uri="http://schemas.openxmlformats.org/drawingml/2006/picture">
+                      <pic:pic xmlns:pic="http://schemas.openxmlformats.org/drawingml/2006/picture">
+                        <pic:nvPicPr>
+                          <pic:cNvPr id="900106" name="Imza Fatih Salbars"/>
+                          <pic:cNvPicPr/>
+                        </pic:nvPicPr>
+                        <pic:blipFill>
+                          <a:blip r:embed="sigFatih"/>
+                          <a:stretch>
+                            <a:fillRect/>
+                          </a:stretch>
+                        </pic:blipFill>
+                        <pic:spPr>
+                          <a:xfrm>
+                            <a:off x="0" y="0"/>
+                            <a:ext cx="944879" cy="566928"/>
+                          </a:xfrm>
+                          <a:prstGeom prst="rect">
+                            <a:avLst/>
+                          </a:prstGeom>
+                        </pic:spPr>
+                      </pic:pic>
+                    </a:graphicData>
+                  </a:graphic>
+                </wp:inline>
+              </w:drawing>
+            </w:r>
           </w:p>
         </w:tc>
       </w:tr>

</xml_diff>